<commit_message>
Update project documentation docx with chapter 9 deliverables section
</commit_message>
<xml_diff>
--- a/Pakistan_Weather_Analytics_Portal_Documentation.docx
+++ b/Pakistan_Weather_Analytics_Portal_Documentation.docx
@@ -1475,6 +1475,222 @@
           <w:sz w:val="20"/>
         </w:rPr>
         <w:t>18</w:t>
+      </w:r>
+    </w:p>
+    <w:p>
+      <w:pPr>
+        <w:spacing w:before="40" w:after="80" w:line="276" w:lineRule="auto"/>
+        <w:jc w:val="left"/>
+      </w:pPr>
+      <w:r>
+        <w:rPr>
+          <w:rFonts w:ascii="Calibri" w:hAnsi="Calibri"/>
+          <w:b/>
+          <w:i w:val="0"/>
+          <w:color w:val="0F172A"/>
+          <w:sz w:val="22"/>
+        </w:rPr>
+        <w:t>PROJECT SUBMISSION DELIVERABLES</w:t>
+      </w:r>
+      <w:r>
+        <w:rPr>
+          <w:rFonts w:ascii="Calibri" w:hAnsi="Calibri"/>
+          <w:b w:val="0"/>
+          <w:i w:val="0"/>
+          <w:color w:val="64748B"/>
+          <w:sz w:val="20"/>
+        </w:rPr>
+        <w:t>......................................................</w:t>
+      </w:r>
+      <w:r>
+        <w:rPr>
+          <w:rFonts w:ascii="Calibri" w:hAnsi="Calibri"/>
+          <w:b/>
+          <w:i w:val="0"/>
+          <w:color w:val="0F172A"/>
+          <w:sz w:val="22"/>
+        </w:rPr>
+        <w:t>19</w:t>
+      </w:r>
+    </w:p>
+    <w:p>
+      <w:pPr>
+        <w:spacing w:before="40" w:after="80" w:line="276" w:lineRule="auto"/>
+        <w:jc w:val="left"/>
+      </w:pPr>
+      <w:r>
+        <w:rPr>
+          <w:rFonts w:ascii="Calibri" w:hAnsi="Calibri"/>
+          <w:b w:val="0"/>
+          <w:i w:val="0"/>
+          <w:color w:val="334155"/>
+          <w:sz w:val="20"/>
+        </w:rPr>
+        <w:t xml:space="preserve">  9.1 Source Code Structure</w:t>
+      </w:r>
+      <w:r>
+        <w:rPr>
+          <w:rFonts w:ascii="Calibri" w:hAnsi="Calibri"/>
+          <w:b w:val="0"/>
+          <w:i w:val="0"/>
+          <w:color w:val="64748B"/>
+          <w:sz w:val="20"/>
+        </w:rPr>
+        <w:t>..........................................................</w:t>
+      </w:r>
+      <w:r>
+        <w:rPr>
+          <w:rFonts w:ascii="Calibri" w:hAnsi="Calibri"/>
+          <w:b w:val="0"/>
+          <w:i w:val="0"/>
+          <w:color w:val="334155"/>
+          <w:sz w:val="20"/>
+        </w:rPr>
+        <w:t>19</w:t>
+      </w:r>
+    </w:p>
+    <w:p>
+      <w:pPr>
+        <w:spacing w:before="40" w:after="80" w:line="276" w:lineRule="auto"/>
+        <w:jc w:val="left"/>
+      </w:pPr>
+      <w:r>
+        <w:rPr>
+          <w:rFonts w:ascii="Calibri" w:hAnsi="Calibri"/>
+          <w:b w:val="0"/>
+          <w:i w:val="0"/>
+          <w:color w:val="334155"/>
+          <w:sz w:val="20"/>
+        </w:rPr>
+        <w:t xml:space="preserve">  9.2 Climate Dataset Specification</w:t>
+      </w:r>
+      <w:r>
+        <w:rPr>
+          <w:rFonts w:ascii="Calibri" w:hAnsi="Calibri"/>
+          <w:b w:val="0"/>
+          <w:i w:val="0"/>
+          <w:color w:val="64748B"/>
+          <w:sz w:val="20"/>
+        </w:rPr>
+        <w:t>..................................................</w:t>
+      </w:r>
+      <w:r>
+        <w:rPr>
+          <w:rFonts w:ascii="Calibri" w:hAnsi="Calibri"/>
+          <w:b w:val="0"/>
+          <w:i w:val="0"/>
+          <w:color w:val="334155"/>
+          <w:sz w:val="20"/>
+        </w:rPr>
+        <w:t>19</w:t>
+      </w:r>
+    </w:p>
+    <w:p>
+      <w:pPr>
+        <w:spacing w:before="40" w:after="80" w:line="276" w:lineRule="auto"/>
+        <w:jc w:val="left"/>
+      </w:pPr>
+      <w:r>
+        <w:rPr>
+          <w:rFonts w:ascii="Calibri" w:hAnsi="Calibri"/>
+          <w:b w:val="0"/>
+          <w:i w:val="0"/>
+          <w:color w:val="334155"/>
+          <w:sz w:val="20"/>
+        </w:rPr>
+        <w:t xml:space="preserve">  9.3 Interface Screenshots Listing</w:t>
+      </w:r>
+      <w:r>
+        <w:rPr>
+          <w:rFonts w:ascii="Calibri" w:hAnsi="Calibri"/>
+          <w:b w:val="0"/>
+          <w:i w:val="0"/>
+          <w:color w:val="64748B"/>
+          <w:sz w:val="20"/>
+        </w:rPr>
+        <w:t>..................................................</w:t>
+      </w:r>
+      <w:r>
+        <w:rPr>
+          <w:rFonts w:ascii="Calibri" w:hAnsi="Calibri"/>
+          <w:b w:val="0"/>
+          <w:i w:val="0"/>
+          <w:color w:val="334155"/>
+          <w:sz w:val="20"/>
+        </w:rPr>
+        <w:t>20</w:t>
+      </w:r>
+    </w:p>
+    <w:p>
+      <w:pPr>
+        <w:spacing w:before="40" w:after="80" w:line="276" w:lineRule="auto"/>
+        <w:jc w:val="left"/>
+      </w:pPr>
+      <w:r>
+        <w:rPr>
+          <w:rFonts w:ascii="Calibri" w:hAnsi="Calibri"/>
+          <w:b w:val="0"/>
+          <w:i w:val="0"/>
+          <w:color w:val="334155"/>
+          <w:sz w:val="20"/>
+        </w:rPr>
+        <w:t xml:space="preserve">  9.4 Step-by-Step User Manual</w:t>
+      </w:r>
+      <w:r>
+        <w:rPr>
+          <w:rFonts w:ascii="Calibri" w:hAnsi="Calibri"/>
+          <w:b w:val="0"/>
+          <w:i w:val="0"/>
+          <w:color w:val="64748B"/>
+          <w:sz w:val="20"/>
+        </w:rPr>
+        <w:t>.......................................................</w:t>
+      </w:r>
+      <w:r>
+        <w:rPr>
+          <w:rFonts w:ascii="Calibri" w:hAnsi="Calibri"/>
+          <w:b w:val="0"/>
+          <w:i w:val="0"/>
+          <w:color w:val="334155"/>
+          <w:sz w:val="20"/>
+        </w:rPr>
+        <w:t>20</w:t>
+      </w:r>
+    </w:p>
+    <w:p>
+      <w:pPr>
+        <w:spacing w:before="40" w:after="80" w:line="276" w:lineRule="auto"/>
+        <w:jc w:val="left"/>
+      </w:pPr>
+      <w:r>
+        <w:rPr>
+          <w:rFonts w:ascii="Calibri" w:hAnsi="Calibri"/>
+          <w:b w:val="0"/>
+          <w:i w:val="0"/>
+          <w:color w:val="334155"/>
+          <w:sz w:val="20"/>
+        </w:rPr>
+        <w:t xml:space="preserve">  9.5 Presentation Slides Overview</w:t>
+      </w:r>
+      <w:r>
+        <w:rPr>
+          <w:rFonts w:ascii="Calibri" w:hAnsi="Calibri"/>
+          <w:b w:val="0"/>
+          <w:i w:val="0"/>
+          <w:color w:val="64748B"/>
+          <w:sz w:val="20"/>
+        </w:rPr>
+        <w:t>...................................................</w:t>
+      </w:r>
+      <w:r>
+        <w:rPr>
+          <w:rFonts w:ascii="Calibri" w:hAnsi="Calibri"/>
+          <w:b w:val="0"/>
+          <w:i w:val="0"/>
+          <w:color w:val="334155"/>
+          <w:sz w:val="20"/>
+        </w:rPr>
+        <w:t>21</w:t>
       </w:r>
     </w:p>
     <w:p>
@@ -8036,6 +8252,865 @@
       </w:r>
     </w:p>
     <w:p>
+      <w:r>
+        <w:br w:type="page"/>
+      </w:r>
+    </w:p>
+    <w:p>
+      <w:pPr>
+        <w:keepNext/>
+        <w:spacing w:before="360" w:after="160" w:line="276" w:lineRule="auto"/>
+        <w:jc w:val="left"/>
+      </w:pPr>
+      <w:r>
+        <w:rPr>
+          <w:rFonts w:ascii="Calibri" w:hAnsi="Calibri"/>
+          <w:b/>
+          <w:i w:val="0"/>
+          <w:color w:val="0F172A"/>
+          <w:sz w:val="36"/>
+        </w:rPr>
+        <w:t>9. PROJECT SUBMISSION DELIVERABLES</w:t>
+      </w:r>
+    </w:p>
+    <w:p>
+      <w:pPr>
+        <w:keepNext/>
+        <w:spacing w:before="240" w:after="80" w:line="276" w:lineRule="auto"/>
+        <w:jc w:val="left"/>
+      </w:pPr>
+      <w:r>
+        <w:rPr>
+          <w:rFonts w:ascii="Calibri" w:hAnsi="Calibri"/>
+          <w:b/>
+          <w:i w:val="0"/>
+          <w:color w:val="2563EB"/>
+          <w:sz w:val="28"/>
+        </w:rPr>
+        <w:t>9.1 Source Code Structure</w:t>
+      </w:r>
+    </w:p>
+    <w:p>
+      <w:pPr>
+        <w:spacing w:before="0" w:after="120" w:line="276" w:lineRule="auto"/>
+        <w:jc w:val="left"/>
+      </w:pPr>
+      <w:r>
+        <w:rPr>
+          <w:rFonts w:ascii="Calibri" w:hAnsi="Calibri"/>
+          <w:b w:val="0"/>
+          <w:i w:val="0"/>
+          <w:color w:val="334155"/>
+          <w:sz w:val="22"/>
+        </w:rPr>
+        <w:t>The full project codebase is submitted as a clean directory tree. Main configuration parameters are decoupled in .env, and Gunicorn is used as the WSGI server. Standard directories include:</w:t>
+      </w:r>
+    </w:p>
+    <w:p>
+      <w:pPr>
+        <w:spacing w:before="0" w:after="60" w:line="276" w:lineRule="auto"/>
+        <w:ind w:left="360" w:hanging="216"/>
+        <w:jc w:val="left"/>
+      </w:pPr>
+      <w:r>
+        <w:rPr>
+          <w:rFonts w:ascii="Calibri" w:hAnsi="Calibri"/>
+          <w:b/>
+          <w:i w:val="0"/>
+          <w:color w:val="2563EB"/>
+          <w:sz w:val="22"/>
+        </w:rPr>
+        <w:t xml:space="preserve">• </w:t>
+      </w:r>
+      <w:r>
+        <w:rPr>
+          <w:rFonts w:ascii="Calibri" w:hAnsi="Calibri"/>
+          <w:b/>
+          <w:i w:val="0"/>
+          <w:color w:val="0F172A"/>
+          <w:sz w:val="22"/>
+        </w:rPr>
+        <w:t xml:space="preserve">weather_portal/ (Project Core): </w:t>
+      </w:r>
+      <w:r>
+        <w:rPr>
+          <w:rFonts w:ascii="Calibri" w:hAnsi="Calibri"/>
+          <w:b w:val="0"/>
+          <w:i w:val="0"/>
+          <w:color w:val="334155"/>
+          <w:sz w:val="22"/>
+        </w:rPr>
+        <w:t>Contains settings.py configuration, monkey-patches, and Gunicorn routing endpoints.</w:t>
+      </w:r>
+    </w:p>
+    <w:p>
+      <w:pPr>
+        <w:spacing w:before="0" w:after="60" w:line="276" w:lineRule="auto"/>
+        <w:ind w:left="360" w:hanging="216"/>
+        <w:jc w:val="left"/>
+      </w:pPr>
+      <w:r>
+        <w:rPr>
+          <w:rFonts w:ascii="Calibri" w:hAnsi="Calibri"/>
+          <w:b/>
+          <w:i w:val="0"/>
+          <w:color w:val="2563EB"/>
+          <w:sz w:val="22"/>
+        </w:rPr>
+        <w:t xml:space="preserve">• </w:t>
+      </w:r>
+      <w:r>
+        <w:rPr>
+          <w:rFonts w:ascii="Calibri" w:hAnsi="Calibri"/>
+          <w:b/>
+          <w:i w:val="0"/>
+          <w:color w:val="0F172A"/>
+          <w:sz w:val="22"/>
+        </w:rPr>
+        <w:t xml:space="preserve">accounts/ (Auth App): </w:t>
+      </w:r>
+      <w:r>
+        <w:rPr>
+          <w:rFonts w:ascii="Calibri" w:hAnsi="Calibri"/>
+          <w:b w:val="0"/>
+          <w:i w:val="0"/>
+          <w:color w:val="334155"/>
+          <w:sz w:val="22"/>
+        </w:rPr>
+        <w:t>Holds registration, login, profile custom fields, database signals, and token custom generators.</w:t>
+      </w:r>
+    </w:p>
+    <w:p>
+      <w:pPr>
+        <w:spacing w:before="0" w:after="60" w:line="276" w:lineRule="auto"/>
+        <w:ind w:left="360" w:hanging="216"/>
+        <w:jc w:val="left"/>
+      </w:pPr>
+      <w:r>
+        <w:rPr>
+          <w:rFonts w:ascii="Calibri" w:hAnsi="Calibri"/>
+          <w:b/>
+          <w:i w:val="0"/>
+          <w:color w:val="2563EB"/>
+          <w:sz w:val="22"/>
+        </w:rPr>
+        <w:t xml:space="preserve">• </w:t>
+      </w:r>
+      <w:r>
+        <w:rPr>
+          <w:rFonts w:ascii="Calibri" w:hAnsi="Calibri"/>
+          <w:b/>
+          <w:i w:val="0"/>
+          <w:color w:val="0F172A"/>
+          <w:sz w:val="22"/>
+        </w:rPr>
+        <w:t xml:space="preserve">weather/ (Core App): </w:t>
+      </w:r>
+      <w:r>
+        <w:rPr>
+          <w:rFonts w:ascii="Calibri" w:hAnsi="Calibri"/>
+          <w:b w:val="0"/>
+          <w:i w:val="0"/>
+          <w:color w:val="334155"/>
+          <w:sz w:val="22"/>
+        </w:rPr>
+        <w:t>Manages data tables, CSV ingestion utilities, Matplotlib report builders, and cron task dispatch scripts.</w:t>
+      </w:r>
+    </w:p>
+    <w:p>
+      <w:pPr>
+        <w:spacing w:before="0" w:after="60" w:line="276" w:lineRule="auto"/>
+        <w:ind w:left="360" w:hanging="216"/>
+        <w:jc w:val="left"/>
+      </w:pPr>
+      <w:r>
+        <w:rPr>
+          <w:rFonts w:ascii="Calibri" w:hAnsi="Calibri"/>
+          <w:b/>
+          <w:i w:val="0"/>
+          <w:color w:val="2563EB"/>
+          <w:sz w:val="22"/>
+        </w:rPr>
+        <w:t xml:space="preserve">• </w:t>
+      </w:r>
+      <w:r>
+        <w:rPr>
+          <w:rFonts w:ascii="Calibri" w:hAnsi="Calibri"/>
+          <w:b/>
+          <w:i w:val="0"/>
+          <w:color w:val="0F172A"/>
+          <w:sz w:val="22"/>
+        </w:rPr>
+        <w:t xml:space="preserve">static/ &amp; templates/ (Assets): </w:t>
+      </w:r>
+      <w:r>
+        <w:rPr>
+          <w:rFonts w:ascii="Calibri" w:hAnsi="Calibri"/>
+          <w:b w:val="0"/>
+          <w:i w:val="0"/>
+          <w:color w:val="334155"/>
+          <w:sz w:val="22"/>
+        </w:rPr>
+        <w:t>Includes Google fonts, logo image assets, responsive dark-mode stylesheets, and dynamic interactive scripts.</w:t>
+      </w:r>
+    </w:p>
+    <w:p>
+      <w:pPr>
+        <w:keepNext/>
+        <w:spacing w:before="240" w:after="80" w:line="276" w:lineRule="auto"/>
+        <w:jc w:val="left"/>
+      </w:pPr>
+      <w:r>
+        <w:rPr>
+          <w:rFonts w:ascii="Calibri" w:hAnsi="Calibri"/>
+          <w:b/>
+          <w:i w:val="0"/>
+          <w:color w:val="2563EB"/>
+          <w:sz w:val="28"/>
+        </w:rPr>
+        <w:t>9.2 Climate Dataset Specification</w:t>
+      </w:r>
+    </w:p>
+    <w:p>
+      <w:pPr>
+        <w:spacing w:before="0" w:after="120" w:line="276" w:lineRule="auto"/>
+        <w:jc w:val="left"/>
+      </w:pPr>
+      <w:r>
+        <w:rPr>
+          <w:rFonts w:ascii="Calibri" w:hAnsi="Calibri"/>
+          <w:b w:val="0"/>
+          <w:i w:val="0"/>
+          <w:color w:val="334155"/>
+          <w:sz w:val="22"/>
+        </w:rPr>
+        <w:t>A sample dataset is provided as a seed file under data/weather_data_seed.csv. It represents over 1,000 observations of daily weather data for 12 major cities in Pakistan (Lahore, Karachi, Islamabad, Peshawar, Rawalpindi, Faisalabad, Multan, Quetta, Sialkot, Gujranwala, Hyderabad, Bahawalpur). It includes variables such as Temp Max, Temp Min, Avg Temp, Humidity %, Precipitation mm, Wind speed km/h, Wind direction, Pressure hPa, and Weather Condition tags.</w:t>
+      </w:r>
+    </w:p>
+    <w:p>
+      <w:pPr>
+        <w:keepNext/>
+        <w:spacing w:before="240" w:after="80" w:line="276" w:lineRule="auto"/>
+        <w:jc w:val="left"/>
+      </w:pPr>
+      <w:r>
+        <w:rPr>
+          <w:rFonts w:ascii="Calibri" w:hAnsi="Calibri"/>
+          <w:b/>
+          <w:i w:val="0"/>
+          <w:color w:val="2563EB"/>
+          <w:sz w:val="28"/>
+        </w:rPr>
+        <w:t>9.3 Interface Screenshots Listing</w:t>
+      </w:r>
+    </w:p>
+    <w:p>
+      <w:pPr>
+        <w:spacing w:before="0" w:after="120" w:line="276" w:lineRule="auto"/>
+        <w:jc w:val="left"/>
+      </w:pPr>
+      <w:r>
+        <w:rPr>
+          <w:rFonts w:ascii="Calibri" w:hAnsi="Calibri"/>
+          <w:b w:val="0"/>
+          <w:i w:val="0"/>
+          <w:color w:val="334155"/>
+          <w:sz w:val="22"/>
+        </w:rPr>
+        <w:t>For grading and visualization purposes, the submission folder contains a dedicated screenshots catalog capturing:</w:t>
+      </w:r>
+    </w:p>
+    <w:p>
+      <w:pPr>
+        <w:spacing w:before="0" w:after="60" w:line="276" w:lineRule="auto"/>
+        <w:ind w:left="360" w:hanging="216"/>
+        <w:jc w:val="left"/>
+      </w:pPr>
+      <w:r>
+        <w:rPr>
+          <w:rFonts w:ascii="Calibri" w:hAnsi="Calibri"/>
+          <w:b/>
+          <w:i w:val="0"/>
+          <w:color w:val="2563EB"/>
+          <w:sz w:val="22"/>
+        </w:rPr>
+        <w:t xml:space="preserve">• </w:t>
+      </w:r>
+      <w:r>
+        <w:rPr>
+          <w:rFonts w:ascii="Calibri" w:hAnsi="Calibri"/>
+          <w:b/>
+          <w:i w:val="0"/>
+          <w:color w:val="0F172A"/>
+          <w:sz w:val="22"/>
+        </w:rPr>
+        <w:t>1. Home Page:</w:t>
+      </w:r>
+      <w:r>
+        <w:rPr>
+          <w:rFonts w:ascii="Calibri" w:hAnsi="Calibri"/>
+          <w:b w:val="0"/>
+          <w:i w:val="0"/>
+          <w:color w:val="334155"/>
+          <w:sz w:val="22"/>
+        </w:rPr>
+        <w:t>Highlighting live API updates and interactive cards for Lahore, Karachi, Islamabad, and Peshawar.</w:t>
+      </w:r>
+    </w:p>
+    <w:p>
+      <w:pPr>
+        <w:spacing w:before="0" w:after="60" w:line="276" w:lineRule="auto"/>
+        <w:ind w:left="360" w:hanging="216"/>
+        <w:jc w:val="left"/>
+      </w:pPr>
+      <w:r>
+        <w:rPr>
+          <w:rFonts w:ascii="Calibri" w:hAnsi="Calibri"/>
+          <w:b/>
+          <w:i w:val="0"/>
+          <w:color w:val="2563EB"/>
+          <w:sz w:val="22"/>
+        </w:rPr>
+        <w:t xml:space="preserve">• </w:t>
+      </w:r>
+      <w:r>
+        <w:rPr>
+          <w:rFonts w:ascii="Calibri" w:hAnsi="Calibri"/>
+          <w:b/>
+          <w:i w:val="0"/>
+          <w:color w:val="0F172A"/>
+          <w:sz w:val="22"/>
+        </w:rPr>
+        <w:t>2. Interactive Analytics Dashboard:</w:t>
+      </w:r>
+      <w:r>
+        <w:rPr>
+          <w:rFonts w:ascii="Calibri" w:hAnsi="Calibri"/>
+          <w:b w:val="0"/>
+          <w:i w:val="0"/>
+          <w:color w:val="334155"/>
+          <w:sz w:val="22"/>
+        </w:rPr>
+        <w:t>Presenting summary statistics cards, query filters, and interactive trend charts.</w:t>
+      </w:r>
+    </w:p>
+    <w:p>
+      <w:pPr>
+        <w:spacing w:before="0" w:after="60" w:line="276" w:lineRule="auto"/>
+        <w:ind w:left="360" w:hanging="216"/>
+        <w:jc w:val="left"/>
+      </w:pPr>
+      <w:r>
+        <w:rPr>
+          <w:rFonts w:ascii="Calibri" w:hAnsi="Calibri"/>
+          <w:b/>
+          <w:i w:val="0"/>
+          <w:color w:val="2563EB"/>
+          <w:sz w:val="22"/>
+        </w:rPr>
+        <w:t xml:space="preserve">• </w:t>
+      </w:r>
+      <w:r>
+        <w:rPr>
+          <w:rFonts w:ascii="Calibri" w:hAnsi="Calibri"/>
+          <w:b/>
+          <w:i w:val="0"/>
+          <w:color w:val="0F172A"/>
+          <w:sz w:val="22"/>
+        </w:rPr>
+        <w:t>3. Ingestion Console:</w:t>
+      </w:r>
+      <w:r>
+        <w:rPr>
+          <w:rFonts w:ascii="Calibri" w:hAnsi="Calibri"/>
+          <w:b w:val="0"/>
+          <w:i w:val="0"/>
+          <w:color w:val="334155"/>
+          <w:sz w:val="22"/>
+        </w:rPr>
+        <w:t>Including file upload fields, validation reports, and duplicate avoidance notifications.</w:t>
+      </w:r>
+    </w:p>
+    <w:p>
+      <w:pPr>
+        <w:spacing w:before="0" w:after="60" w:line="276" w:lineRule="auto"/>
+        <w:ind w:left="360" w:hanging="216"/>
+        <w:jc w:val="left"/>
+      </w:pPr>
+      <w:r>
+        <w:rPr>
+          <w:rFonts w:ascii="Calibri" w:hAnsi="Calibri"/>
+          <w:b/>
+          <w:i w:val="0"/>
+          <w:color w:val="2563EB"/>
+          <w:sz w:val="22"/>
+        </w:rPr>
+        <w:t xml:space="preserve">• </w:t>
+      </w:r>
+      <w:r>
+        <w:rPr>
+          <w:rFonts w:ascii="Calibri" w:hAnsi="Calibri"/>
+          <w:b/>
+          <w:i w:val="0"/>
+          <w:color w:val="0F172A"/>
+          <w:sz w:val="22"/>
+        </w:rPr>
+        <w:t>4. Historical Search Database:</w:t>
+      </w:r>
+      <w:r>
+        <w:rPr>
+          <w:rFonts w:ascii="Calibri" w:hAnsi="Calibri"/>
+          <w:b w:val="0"/>
+          <w:i w:val="0"/>
+          <w:color w:val="334155"/>
+          <w:sz w:val="22"/>
+        </w:rPr>
+        <w:t>Exposing search fields, pagination, and instant CSV/PDF export download triggers.</w:t>
+      </w:r>
+    </w:p>
+    <w:p>
+      <w:pPr>
+        <w:spacing w:before="0" w:after="60" w:line="276" w:lineRule="auto"/>
+        <w:ind w:left="360" w:hanging="216"/>
+        <w:jc w:val="left"/>
+      </w:pPr>
+      <w:r>
+        <w:rPr>
+          <w:rFonts w:ascii="Calibri" w:hAnsi="Calibri"/>
+          <w:b/>
+          <w:i w:val="0"/>
+          <w:color w:val="2563EB"/>
+          <w:sz w:val="22"/>
+        </w:rPr>
+        <w:t xml:space="preserve">• </w:t>
+      </w:r>
+      <w:r>
+        <w:rPr>
+          <w:rFonts w:ascii="Calibri" w:hAnsi="Calibri"/>
+          <w:b/>
+          <w:i w:val="0"/>
+          <w:color w:val="0F172A"/>
+          <w:sz w:val="22"/>
+        </w:rPr>
+        <w:t>5. Compiled PDF Bulletins:</w:t>
+      </w:r>
+      <w:r>
+        <w:rPr>
+          <w:rFonts w:ascii="Calibri" w:hAnsi="Calibri"/>
+          <w:b w:val="0"/>
+          <w:i w:val="0"/>
+          <w:color w:val="334155"/>
+          <w:sz w:val="22"/>
+        </w:rPr>
+        <w:t>Displaying layout grid designs, dynamic headers, city weather summaries, and footer configurations.</w:t>
+      </w:r>
+    </w:p>
+    <w:p>
+      <w:pPr>
+        <w:keepNext/>
+        <w:spacing w:before="240" w:after="80" w:line="276" w:lineRule="auto"/>
+        <w:jc w:val="left"/>
+      </w:pPr>
+      <w:r>
+        <w:rPr>
+          <w:rFonts w:ascii="Calibri" w:hAnsi="Calibri"/>
+          <w:b/>
+          <w:i w:val="0"/>
+          <w:color w:val="2563EB"/>
+          <w:sz w:val="28"/>
+        </w:rPr>
+        <w:t>9.4 Step-by-Step User Manual</w:t>
+      </w:r>
+    </w:p>
+    <w:p>
+      <w:pPr>
+        <w:spacing w:before="0" w:after="120" w:line="276" w:lineRule="auto"/>
+        <w:jc w:val="left"/>
+      </w:pPr>
+      <w:r>
+        <w:rPr>
+          <w:rFonts w:ascii="Calibri" w:hAnsi="Calibri"/>
+          <w:b w:val="0"/>
+          <w:i w:val="0"/>
+          <w:color w:val="334155"/>
+          <w:sz w:val="22"/>
+        </w:rPr>
+        <w:t>The project features a straightforward user flow designed to maximize access safety and data utility:</w:t>
+      </w:r>
+    </w:p>
+    <w:p>
+      <w:pPr>
+        <w:spacing w:before="0" w:after="120" w:line="276" w:lineRule="auto"/>
+        <w:jc w:val="left"/>
+      </w:pPr>
+      <w:r>
+        <w:rPr>
+          <w:rFonts w:ascii="Calibri" w:hAnsi="Calibri"/>
+          <w:b w:val="0"/>
+          <w:i w:val="0"/>
+          <w:color w:val="334155"/>
+          <w:sz w:val="22"/>
+        </w:rPr>
+        <w:t>Step 1: Go to the homepage. View live weather statistics for Pakistani cities fetched from the Open-Meteo API.</w:t>
+      </w:r>
+    </w:p>
+    <w:p>
+      <w:pPr>
+        <w:spacing w:before="0" w:after="120" w:line="276" w:lineRule="auto"/>
+        <w:jc w:val="left"/>
+      </w:pPr>
+      <w:r>
+        <w:rPr>
+          <w:rFonts w:ascii="Calibri" w:hAnsi="Calibri"/>
+          <w:b w:val="0"/>
+          <w:i w:val="0"/>
+          <w:color w:val="334155"/>
+          <w:sz w:val="22"/>
+        </w:rPr>
+        <w:t>Step 2: Click 'Sign Up' in the navbar to open the register template. Enter a username, email, and password. In local debug mode, click the developer bypass link on the redirect page to verify instantly; in production, complete verification via email activation token.</w:t>
+      </w:r>
+    </w:p>
+    <w:p>
+      <w:pPr>
+        <w:spacing w:before="0" w:after="120" w:line="276" w:lineRule="auto"/>
+        <w:jc w:val="left"/>
+      </w:pPr>
+      <w:r>
+        <w:rPr>
+          <w:rFonts w:ascii="Calibri" w:hAnsi="Calibri"/>
+          <w:b w:val="0"/>
+          <w:i w:val="0"/>
+          <w:color w:val="334155"/>
+          <w:sz w:val="22"/>
+        </w:rPr>
+        <w:t>Step 3: Log in using your verified profile credentials to access the main Dashboard page. Use filters to view average temp, humidity, and pressure variations.</w:t>
+      </w:r>
+    </w:p>
+    <w:p>
+      <w:pPr>
+        <w:spacing w:before="0" w:after="120" w:line="276" w:lineRule="auto"/>
+        <w:jc w:val="left"/>
+      </w:pPr>
+      <w:r>
+        <w:rPr>
+          <w:rFonts w:ascii="Calibri" w:hAnsi="Calibri"/>
+          <w:b w:val="0"/>
+          <w:i w:val="0"/>
+          <w:color w:val="334155"/>
+          <w:sz w:val="22"/>
+        </w:rPr>
+        <w:t>Step 4: Navigate to 'Upload' to ingest custom meteorological CSV records. Verify that duplicates are safely updated in-place.</w:t>
+      </w:r>
+    </w:p>
+    <w:p>
+      <w:pPr>
+        <w:spacing w:before="0" w:after="120" w:line="276" w:lineRule="auto"/>
+        <w:jc w:val="left"/>
+      </w:pPr>
+      <w:r>
+        <w:rPr>
+          <w:rFonts w:ascii="Calibri" w:hAnsi="Calibri"/>
+          <w:b w:val="0"/>
+          <w:i w:val="0"/>
+          <w:color w:val="334155"/>
+          <w:sz w:val="22"/>
+        </w:rPr>
+        <w:t>Step 5: Go to the Profile page, choose your preferred cities list, and toggle the 'Receive Daily Reports' option to automate server-side PDF dispatches.</w:t>
+      </w:r>
+    </w:p>
+    <w:p>
+      <w:pPr>
+        <w:keepNext/>
+        <w:spacing w:before="240" w:after="80" w:line="276" w:lineRule="auto"/>
+        <w:jc w:val="left"/>
+      </w:pPr>
+      <w:r>
+        <w:rPr>
+          <w:rFonts w:ascii="Calibri" w:hAnsi="Calibri"/>
+          <w:b/>
+          <w:i w:val="0"/>
+          <w:color w:val="2563EB"/>
+          <w:sz w:val="28"/>
+        </w:rPr>
+        <w:t>9.5 Presentation Slides Overview</w:t>
+      </w:r>
+    </w:p>
+    <w:p>
+      <w:pPr>
+        <w:spacing w:before="0" w:after="120" w:line="276" w:lineRule="auto"/>
+        <w:jc w:val="left"/>
+      </w:pPr>
+      <w:r>
+        <w:rPr>
+          <w:rFonts w:ascii="Calibri" w:hAnsi="Calibri"/>
+          <w:b w:val="0"/>
+          <w:i w:val="0"/>
+          <w:color w:val="334155"/>
+          <w:sz w:val="22"/>
+        </w:rPr>
+        <w:t>The university presentation slide deck is organized as follows:</w:t>
+      </w:r>
+    </w:p>
+    <w:p>
+      <w:pPr>
+        <w:spacing w:before="0" w:after="60" w:line="276" w:lineRule="auto"/>
+        <w:ind w:left="360" w:hanging="216"/>
+        <w:jc w:val="left"/>
+      </w:pPr>
+      <w:r>
+        <w:rPr>
+          <w:rFonts w:ascii="Calibri" w:hAnsi="Calibri"/>
+          <w:b/>
+          <w:i w:val="0"/>
+          <w:color w:val="2563EB"/>
+          <w:sz w:val="22"/>
+        </w:rPr>
+        <w:t xml:space="preserve">• </w:t>
+      </w:r>
+      <w:r>
+        <w:rPr>
+          <w:rFonts w:ascii="Calibri" w:hAnsi="Calibri"/>
+          <w:b/>
+          <w:i w:val="0"/>
+          <w:color w:val="0F172A"/>
+          <w:sz w:val="22"/>
+        </w:rPr>
+        <w:t>Slide 1: Title &amp; Overview:</w:t>
+      </w:r>
+      <w:r>
+        <w:rPr>
+          <w:rFonts w:ascii="Calibri" w:hAnsi="Calibri"/>
+          <w:b w:val="0"/>
+          <w:i w:val="0"/>
+          <w:color w:val="334155"/>
+          <w:sz w:val="22"/>
+        </w:rPr>
+        <w:t>Project title, team names, university logo, and access links.</w:t>
+      </w:r>
+    </w:p>
+    <w:p>
+      <w:pPr>
+        <w:spacing w:before="0" w:after="60" w:line="276" w:lineRule="auto"/>
+        <w:ind w:left="360" w:hanging="216"/>
+        <w:jc w:val="left"/>
+      </w:pPr>
+      <w:r>
+        <w:rPr>
+          <w:rFonts w:ascii="Calibri" w:hAnsi="Calibri"/>
+          <w:b/>
+          <w:i w:val="0"/>
+          <w:color w:val="2563EB"/>
+          <w:sz w:val="22"/>
+        </w:rPr>
+        <w:t xml:space="preserve">• </w:t>
+      </w:r>
+      <w:r>
+        <w:rPr>
+          <w:rFonts w:ascii="Calibri" w:hAnsi="Calibri"/>
+          <w:b/>
+          <w:i w:val="0"/>
+          <w:color w:val="0F172A"/>
+          <w:sz w:val="22"/>
+        </w:rPr>
+        <w:t>Slide 2: Introduction &amp; Motivation:</w:t>
+      </w:r>
+      <w:r>
+        <w:rPr>
+          <w:rFonts w:ascii="Calibri" w:hAnsi="Calibri"/>
+          <w:b w:val="0"/>
+          <w:i w:val="0"/>
+          <w:color w:val="334155"/>
+          <w:sz w:val="22"/>
+        </w:rPr>
+        <w:t>Problem statement, legacy database fragmentation, and objectives.</w:t>
+      </w:r>
+    </w:p>
+    <w:p>
+      <w:pPr>
+        <w:spacing w:before="0" w:after="60" w:line="276" w:lineRule="auto"/>
+        <w:ind w:left="360" w:hanging="216"/>
+        <w:jc w:val="left"/>
+      </w:pPr>
+      <w:r>
+        <w:rPr>
+          <w:rFonts w:ascii="Calibri" w:hAnsi="Calibri"/>
+          <w:b/>
+          <w:i w:val="0"/>
+          <w:color w:val="2563EB"/>
+          <w:sz w:val="22"/>
+        </w:rPr>
+        <w:t xml:space="preserve">• </w:t>
+      </w:r>
+      <w:r>
+        <w:rPr>
+          <w:rFonts w:ascii="Calibri" w:hAnsi="Calibri"/>
+          <w:b/>
+          <w:i w:val="0"/>
+          <w:color w:val="0F172A"/>
+          <w:sz w:val="22"/>
+        </w:rPr>
+        <w:t>Slide 3: System Architecture:</w:t>
+      </w:r>
+      <w:r>
+        <w:rPr>
+          <w:rFonts w:ascii="Calibri" w:hAnsi="Calibri"/>
+          <w:b w:val="0"/>
+          <w:i w:val="0"/>
+          <w:color w:val="334155"/>
+          <w:sz w:val="22"/>
+        </w:rPr>
+        <w:t>MVT pattern layout, Pandas data cleaning, and SMTP scheduler details.</w:t>
+      </w:r>
+    </w:p>
+    <w:p>
+      <w:pPr>
+        <w:spacing w:before="0" w:after="60" w:line="276" w:lineRule="auto"/>
+        <w:ind w:left="360" w:hanging="216"/>
+        <w:jc w:val="left"/>
+      </w:pPr>
+      <w:r>
+        <w:rPr>
+          <w:rFonts w:ascii="Calibri" w:hAnsi="Calibri"/>
+          <w:b/>
+          <w:i w:val="0"/>
+          <w:color w:val="2563EB"/>
+          <w:sz w:val="22"/>
+        </w:rPr>
+        <w:t xml:space="preserve">• </w:t>
+      </w:r>
+      <w:r>
+        <w:rPr>
+          <w:rFonts w:ascii="Calibri" w:hAnsi="Calibri"/>
+          <w:b/>
+          <w:i w:val="0"/>
+          <w:color w:val="0F172A"/>
+          <w:sz w:val="22"/>
+        </w:rPr>
+        <w:t>Slide 4: Database Model &amp; Schema Design:</w:t>
+      </w:r>
+      <w:r>
+        <w:rPr>
+          <w:rFonts w:ascii="Calibri" w:hAnsi="Calibri"/>
+          <w:b w:val="0"/>
+          <w:i w:val="0"/>
+          <w:color w:val="334155"/>
+          <w:sz w:val="22"/>
+        </w:rPr>
+        <w:t>Detailed database models, fields, and indices.</w:t>
+      </w:r>
+    </w:p>
+    <w:p>
+      <w:pPr>
+        <w:spacing w:before="0" w:after="60" w:line="276" w:lineRule="auto"/>
+        <w:ind w:left="360" w:hanging="216"/>
+        <w:jc w:val="left"/>
+      </w:pPr>
+      <w:r>
+        <w:rPr>
+          <w:rFonts w:ascii="Calibri" w:hAnsi="Calibri"/>
+          <w:b/>
+          <w:i w:val="0"/>
+          <w:color w:val="2563EB"/>
+          <w:sz w:val="22"/>
+        </w:rPr>
+        <w:t xml:space="preserve">• </w:t>
+      </w:r>
+      <w:r>
+        <w:rPr>
+          <w:rFonts w:ascii="Calibri" w:hAnsi="Calibri"/>
+          <w:b/>
+          <w:i w:val="0"/>
+          <w:color w:val="0F172A"/>
+          <w:sz w:val="22"/>
+        </w:rPr>
+        <w:t>Slide 5: Python 3.14 Compatibility Layer:</w:t>
+      </w:r>
+      <w:r>
+        <w:rPr>
+          <w:rFonts w:ascii="Calibri" w:hAnsi="Calibri"/>
+          <w:b w:val="0"/>
+          <w:i w:val="0"/>
+          <w:color w:val="334155"/>
+          <w:sz w:val="22"/>
+        </w:rPr>
+        <w:t>Monkey-patching Django template context copy loops and overriding build dependencies.</w:t>
+      </w:r>
+    </w:p>
+    <w:p>
+      <w:pPr>
+        <w:spacing w:before="0" w:after="60" w:line="276" w:lineRule="auto"/>
+        <w:ind w:left="360" w:hanging="216"/>
+        <w:jc w:val="left"/>
+      </w:pPr>
+      <w:r>
+        <w:rPr>
+          <w:rFonts w:ascii="Calibri" w:hAnsi="Calibri"/>
+          <w:b/>
+          <w:i w:val="0"/>
+          <w:color w:val="2563EB"/>
+          <w:sz w:val="22"/>
+        </w:rPr>
+        <w:t xml:space="preserve">• </w:t>
+      </w:r>
+      <w:r>
+        <w:rPr>
+          <w:rFonts w:ascii="Calibri" w:hAnsi="Calibri"/>
+          <w:b/>
+          <w:i w:val="0"/>
+          <w:color w:val="0F172A"/>
+          <w:sz w:val="22"/>
+        </w:rPr>
+        <w:t>Slide 6: Server &amp; Cloud Configuration:</w:t>
+      </w:r>
+      <w:r>
+        <w:rPr>
+          <w:rFonts w:ascii="Calibri" w:hAnsi="Calibri"/>
+          <w:b w:val="0"/>
+          <w:i w:val="0"/>
+          <w:color w:val="334155"/>
+          <w:sz w:val="22"/>
+        </w:rPr>
+        <w:t>Pre-deploy collectstatic commands, psycopg2 setup, and Render deployments.</w:t>
+      </w:r>
+    </w:p>
+    <w:p>
+      <w:pPr>
+        <w:spacing w:before="0" w:after="60" w:line="276" w:lineRule="auto"/>
+        <w:ind w:left="360" w:hanging="216"/>
+        <w:jc w:val="left"/>
+      </w:pPr>
+      <w:r>
+        <w:rPr>
+          <w:rFonts w:ascii="Calibri" w:hAnsi="Calibri"/>
+          <w:b/>
+          <w:i w:val="0"/>
+          <w:color w:val="2563EB"/>
+          <w:sz w:val="22"/>
+        </w:rPr>
+        <w:t xml:space="preserve">• </w:t>
+      </w:r>
+      <w:r>
+        <w:rPr>
+          <w:rFonts w:ascii="Calibri" w:hAnsi="Calibri"/>
+          <w:b/>
+          <w:i w:val="0"/>
+          <w:color w:val="0F172A"/>
+          <w:sz w:val="22"/>
+        </w:rPr>
+        <w:t>Slide 7: Conclusion &amp; Future Scope:</w:t>
+      </w:r>
+      <w:r>
+        <w:rPr>
+          <w:rFonts w:ascii="Calibri" w:hAnsi="Calibri"/>
+          <w:b w:val="0"/>
+          <w:i w:val="0"/>
+          <w:color w:val="334155"/>
+          <w:sz w:val="22"/>
+        </w:rPr>
+        <w:t>Project summary, main learnings, and proposed features (ML prediction models).</w:t>
+      </w:r>
+    </w:p>
+    <w:p>
       <w:pPr>
         <w:spacing w:before="800" w:after="0" w:line="276" w:lineRule="auto"/>
         <w:jc w:val="left"/>

</xml_diff>